<commit_message>
Update User Guide to describe the new clickable report UI
Regenerated User_Guide.docx (and its build script) to cover recent report
changes: the document-count highlight row, the two-tile PASS/FAIL summary
(with an explanation of why INFO folds into PASS), clickable checklist/
jump-to-failed navigation, and the single-example-per-issue format.

Co-Authored-By: Claude Sonnet 5 <noreply@anthropic.com>
</commit_message>
<xml_diff>
--- a/User_Guide.docx
+++ b/User_Guide.docx
@@ -533,7 +533,7 @@
           <w:b/>
           <w:sz w:val="23"/>
         </w:rPr>
-        <w:t>If more than one run is found</w:t>
+        <w:t>If more than one version is found</w:t>
       </w:r>
     </w:p>
     <w:p>
@@ -545,7 +545,7 @@
           <w:color w:val="57606A"/>
           <w:sz w:val="21"/>
         </w:rPr>
-        <w:t>A dropdown will let you either view all of them together or pick one specific run to inspect.</w:t>
+        <w:t>A dropdown labeled "Select a version to run" lets you either view all of them together ("All") or pick one specific version to inspect.</w:t>
       </w:r>
     </w:p>
     <w:p>
@@ -611,7 +611,38 @@
           <w:b w:val="0"/>
           <w:sz w:val="22"/>
         </w:rPr>
-        <w:t>At the top of your report you'll see one of three verdicts, followed by a "Checklist at a glance" table summarizing every category, then full details further down.</w:t>
+        <w:t>Right under the report title you'll see a quick document-count summary - the total number of documents, and how many are positive/negative in Agreements and in Disagreements - so you can sanity-check the scale of what was checked at a glance.</w:t>
+      </w:r>
+    </w:p>
+    <w:p>
+      <w:pPr>
+        <w:spacing w:after="160"/>
+      </w:pPr>
+      <w:r>
+        <w:rPr>
+          <w:b w:val="0"/>
+          <w:sz w:val="22"/>
+        </w:rPr>
+        <w:t>Below that is one of three verdicts, two large numbers (PASS and FAIL), a "Checklist at a glance" table summarizing every category, then full details further down.</w:t>
+      </w:r>
+    </w:p>
+    <w:p>
+      <w:pPr>
+        <w:spacing w:before="80" w:after="200"/>
+      </w:pPr>
+      <w:r>
+        <w:rPr>
+          <w:b/>
+          <w:color w:val="0969DA"/>
+        </w:rPr>
+        <w:t xml:space="preserve">Why only PASS and FAIL at the top?  </w:t>
+      </w:r>
+      <w:r>
+        <w:rPr>
+          <w:color w:val="1F2328"/>
+          <w:sz w:val="21"/>
+        </w:rPr>
+        <w:t>Background information notes (see INFO below) are automatically counted as passed at this top level since they don't need any action from you - only a real problem should command your attention here. Warnings still appear further down, with their own amber icon, inside whichever category they belong to.</w:t>
       </w:r>
     </w:p>
     <w:tbl>
@@ -720,7 +751,7 @@
           </w:tcPr>
           <w:p>
             <w:r>
-              <w:t>Not necessarily wrong, but worth a human look before you rely on this output.</w:t>
+              <w:t>Not necessarily wrong, but worth a look before you rely on this output.</w:t>
             </w:r>
           </w:p>
         </w:tc>
@@ -746,7 +777,7 @@
           </w:tcPr>
           <w:p>
             <w:r>
-              <w:t>Background information - not a problem, just useful context (for example, which SIT name was detected).</w:t>
+              <w:t>Background information - not a problem, just useful context (for example, which SIT name was detected). Counted as a pass everywhere in this report.</w:t>
             </w:r>
           </w:p>
         </w:tc>
@@ -762,7 +793,7 @@
           <w:b w:val="0"/>
           <w:sz w:val="22"/>
         </w:rPr>
-        <w:t>Click on any category (like "3. context_output_normalized" or "8. Metadata / Engine Match / Chunk Labels") to expand it and see every individual result. Categories with a FAIL or WARN open automatically so you don't have to hunt for them.</w:t>
+        <w:t>Every row of the "Checklist at a glance" table is clickable - click one (like "context_output_normalized" or "Metadata / Engine Match / Chunk Labels") and the page jumps straight to that category's full detail further down, instead of you having to scroll and hunt for it. If any checks failed, a "Jump to failed check(s)" line right under the verdict banner gives you the same kind of direct links to just the problem categories.</w:t>
       </w:r>
     </w:p>
     <w:p>
@@ -774,7 +805,7 @@
           <w:b w:val="0"/>
           <w:sz w:val="22"/>
         </w:rPr>
-        <w:t>For any FAIL or WARN, read the detail text and the "Suggested fix" line - together they tell you exactly what's wrong and what to do about it.</w:t>
+        <w:t>Categories with a FAIL or WARN open automatically so you don't have to click them open yourself. For any FAIL or WARN, read the detail text and the "Suggested fix" line - together they tell you exactly what's wrong and what to do about it. When a check found many occurrences of the same problem, only one representative example is shown alongside the total count - it's there to show you what the problem looks like, not to list every single occurrence.</w:t>
       </w:r>
     </w:p>
     <w:p>

</xml_diff>

<commit_message>
Fix guide's step numbering and drop the misleading INFO status row
Word's built-in "List Number" style shares one running count for the
whole document, so a second numbered list further down (e.g. Section 6's
steps) confusingly continued the count from an earlier list instead of
restarting at 1. Steps are now numbered explicitly per section.

Also removed INFO from the status table: it never actually appears as
its own visible label anywhere in the report (it's folded into PASS
everywhere, including each category's own count), so listing it as a
distinct status a user would see was inaccurate. The existing note above
the table already explains why info notes count as passing.

Co-Authored-By: Claude Sonnet 5 <noreply@anthropic.com>
</commit_message>
<xml_diff>
--- a/User_Guide.docx
+++ b/User_Guide.docx
@@ -341,19 +341,20 @@
     </w:p>
     <w:p>
       <w:pPr>
-        <w:pStyle w:val="ListNumber"/>
+        <w:spacing w:before="120"/>
+        <w:ind w:left="360"/>
       </w:pPr>
       <w:r>
         <w:rPr>
           <w:b/>
           <w:sz w:val="23"/>
         </w:rPr>
-        <w:t>Find your output folder</w:t>
+        <w:t>1. Find your output folder</w:t>
       </w:r>
     </w:p>
     <w:p>
       <w:pPr>
-        <w:ind w:left="504"/>
+        <w:ind w:left="720"/>
       </w:pPr>
       <w:r>
         <w:rPr>
@@ -365,19 +366,20 @@
     </w:p>
     <w:p>
       <w:pPr>
-        <w:pStyle w:val="ListNumber"/>
+        <w:spacing w:before="120"/>
+        <w:ind w:left="360"/>
       </w:pPr>
       <w:r>
         <w:rPr>
           <w:b/>
           <w:sz w:val="23"/>
         </w:rPr>
-        <w:t>Right-click the folder</w:t>
+        <w:t>2. Right-click the folder</w:t>
       </w:r>
     </w:p>
     <w:p>
       <w:pPr>
-        <w:ind w:left="504"/>
+        <w:ind w:left="720"/>
       </w:pPr>
       <w:r>
         <w:rPr>
@@ -389,19 +391,20 @@
     </w:p>
     <w:p>
       <w:pPr>
-        <w:pStyle w:val="ListNumber"/>
+        <w:spacing w:before="120"/>
+        <w:ind w:left="360"/>
       </w:pPr>
       <w:r>
         <w:rPr>
           <w:b/>
           <w:sz w:val="23"/>
         </w:rPr>
-        <w:t>Wait for it to finish</w:t>
+        <w:t>3. Wait for it to finish</w:t>
       </w:r>
     </w:p>
     <w:p>
       <w:pPr>
-        <w:ind w:left="504"/>
+        <w:ind w:left="720"/>
       </w:pPr>
       <w:r>
         <w:rPr>
@@ -424,19 +427,20 @@
     </w:p>
     <w:p>
       <w:pPr>
-        <w:pStyle w:val="ListNumber"/>
+        <w:spacing w:before="120"/>
+        <w:ind w:left="360"/>
       </w:pPr>
       <w:r>
         <w:rPr>
           <w:b/>
           <w:sz w:val="23"/>
         </w:rPr>
-        <w:t>Open the tool</w:t>
+        <w:t>1. Open the tool</w:t>
       </w:r>
     </w:p>
     <w:p>
       <w:pPr>
-        <w:ind w:left="504"/>
+        <w:ind w:left="720"/>
       </w:pPr>
       <w:r>
         <w:rPr>
@@ -448,43 +452,45 @@
     </w:p>
     <w:p>
       <w:pPr>
-        <w:pStyle w:val="ListNumber"/>
+        <w:spacing w:before="120"/>
+        <w:ind w:left="360"/>
       </w:pPr>
       <w:r>
         <w:rPr>
           <w:b/>
           <w:sz w:val="23"/>
         </w:rPr>
-        <w:t>Upload your archive</w:t>
+        <w:t>2. Upload your archive</w:t>
       </w:r>
     </w:p>
     <w:p>
       <w:pPr>
-        <w:ind w:left="504"/>
+        <w:ind w:left="720"/>
       </w:pPr>
       <w:r>
         <w:rPr>
           <w:color w:val="57606A"/>
           <w:sz w:val="21"/>
         </w:rPr>
-        <w:t>In the left-hand sidebar, click "Browse files" under "Output folder archive" and select the .zip/.7z file you prepared in Step 2 above.</w:t>
+        <w:t>In the left-hand sidebar, click "Browse files" under "Output folder archive" and select the .zip/.7z file you prepared above.</w:t>
       </w:r>
     </w:p>
     <w:p>
       <w:pPr>
-        <w:pStyle w:val="ListNumber"/>
+        <w:spacing w:before="120"/>
+        <w:ind w:left="360"/>
       </w:pPr>
       <w:r>
         <w:rPr>
           <w:b/>
           <w:sz w:val="23"/>
         </w:rPr>
-        <w:t>(Optional) Adjust settings</w:t>
+        <w:t>3. (Optional) Adjust settings</w:t>
       </w:r>
     </w:p>
     <w:p>
       <w:pPr>
-        <w:ind w:left="504"/>
+        <w:ind w:left="720"/>
       </w:pPr>
       <w:r>
         <w:rPr>
@@ -502,19 +508,20 @@
     </w:p>
     <w:p>
       <w:pPr>
-        <w:pStyle w:val="ListNumber"/>
+        <w:spacing w:before="120"/>
+        <w:ind w:left="360"/>
       </w:pPr>
       <w:r>
         <w:rPr>
           <w:b/>
           <w:sz w:val="23"/>
         </w:rPr>
-        <w:t>Click "Run Checks"</w:t>
+        <w:t>4. Click "Run Checks"</w:t>
       </w:r>
     </w:p>
     <w:p>
       <w:pPr>
-        <w:ind w:left="504"/>
+        <w:ind w:left="720"/>
       </w:pPr>
       <w:r>
         <w:rPr>
@@ -526,19 +533,20 @@
     </w:p>
     <w:p>
       <w:pPr>
-        <w:pStyle w:val="ListNumber"/>
+        <w:spacing w:before="120"/>
+        <w:ind w:left="360"/>
       </w:pPr>
       <w:r>
         <w:rPr>
           <w:b/>
           <w:sz w:val="23"/>
         </w:rPr>
-        <w:t>If more than one version is found</w:t>
+        <w:t>5. If more than one version is found</w:t>
       </w:r>
     </w:p>
     <w:p>
       <w:pPr>
-        <w:ind w:left="504"/>
+        <w:ind w:left="720"/>
       </w:pPr>
       <w:r>
         <w:rPr>
@@ -550,19 +558,20 @@
     </w:p>
     <w:p>
       <w:pPr>
-        <w:pStyle w:val="ListNumber"/>
+        <w:spacing w:before="120"/>
+        <w:ind w:left="360"/>
       </w:pPr>
       <w:r>
         <w:rPr>
           <w:b/>
           <w:sz w:val="23"/>
         </w:rPr>
-        <w:t>Review your results</w:t>
+        <w:t>6. Review your results</w:t>
       </w:r>
     </w:p>
     <w:p>
       <w:pPr>
-        <w:ind w:left="504"/>
+        <w:ind w:left="720"/>
       </w:pPr>
       <w:r>
         <w:rPr>
@@ -642,7 +651,7 @@
           <w:color w:val="1F2328"/>
           <w:sz w:val="21"/>
         </w:rPr>
-        <w:t>Background information notes (see INFO below) are automatically counted as passed at this top level since they don't need any action from you - only a real problem should command your attention here. Warnings still appear further down, with their own amber icon, inside whichever category they belong to.</w:t>
+        <w:t>A handful of checks are purely informational (e.g. noting which SIT name was detected) rather than pass/fail judgments - those are folded into PASS everywhere in this report, including in each category's own count, since they never need any action from you. Warnings are real and still appear further down with their own amber icon, inside whichever category they belong to - they're just not tallied in this top summary.</w:t>
       </w:r>
     </w:p>
     <w:tbl>
@@ -751,33 +760,7 @@
           </w:tcPr>
           <w:p>
             <w:r>
-              <w:t>Not necessarily wrong, but worth a look before you rely on this output.</w:t>
-            </w:r>
-          </w:p>
-        </w:tc>
-      </w:tr>
-      <w:tr>
-        <w:tc>
-          <w:tcPr>
-            <w:tcW w:type="dxa" w:w="4320"/>
-          </w:tcPr>
-          <w:p>
-            <w:r>
-              <w:rPr>
-                <w:b/>
-                <w:color w:val="0969DA"/>
-              </w:rPr>
-              <w:t>INFO</w:t>
-            </w:r>
-          </w:p>
-        </w:tc>
-        <w:tc>
-          <w:tcPr>
-            <w:tcW w:type="dxa" w:w="4320"/>
-          </w:tcPr>
-          <w:p>
-            <w:r>
-              <w:t>Background information - not a problem, just useful context (for example, which SIT name was detected). Counted as a pass everywhere in this report.</w:t>
+              <w:t>Not necessarily wrong, but worth a look before you rely on this output - shown less often than PASS/FAIL, only when a check finds something worth a second opinion.</w:t>
             </w:r>
           </w:p>
         </w:tc>
@@ -901,19 +884,20 @@
     </w:p>
     <w:p>
       <w:pPr>
-        <w:pStyle w:val="ListNumber"/>
+        <w:spacing w:before="120"/>
+        <w:ind w:left="360"/>
       </w:pPr>
       <w:r>
         <w:rPr>
           <w:b/>
           <w:sz w:val="23"/>
         </w:rPr>
-        <w:t>Upload your sit_packs archive</w:t>
+        <w:t>1. Upload your sit_packs archive</w:t>
       </w:r>
     </w:p>
     <w:p>
       <w:pPr>
-        <w:ind w:left="504"/>
+        <w:ind w:left="720"/>
       </w:pPr>
       <w:r>
         <w:rPr>
@@ -925,19 +909,20 @@
     </w:p>
     <w:p>
       <w:pPr>
-        <w:pStyle w:val="ListNumber"/>
+        <w:spacing w:before="120"/>
+        <w:ind w:left="360"/>
       </w:pPr>
       <w:r>
         <w:rPr>
           <w:b/>
           <w:sz w:val="23"/>
         </w:rPr>
-        <w:t>(Optional) Upload SIT Specs and/or the 213 MCE keywords file</w:t>
+        <w:t>2. (Optional) Upload SIT Specs and/or the 213 MCE keywords file</w:t>
       </w:r>
     </w:p>
     <w:p>
       <w:pPr>
-        <w:ind w:left="504"/>
+        <w:ind w:left="720"/>
       </w:pPr>
       <w:r>
         <w:rPr>
@@ -949,19 +934,20 @@
     </w:p>
     <w:p>
       <w:pPr>
-        <w:pStyle w:val="ListNumber"/>
+        <w:spacing w:before="120"/>
+        <w:ind w:left="360"/>
       </w:pPr>
       <w:r>
         <w:rPr>
           <w:b/>
           <w:sz w:val="23"/>
         </w:rPr>
-        <w:t>Look up a specific SIT + language</w:t>
+        <w:t>3. Look up a specific SIT + language</w:t>
       </w:r>
     </w:p>
     <w:p>
       <w:pPr>
-        <w:ind w:left="504"/>
+        <w:ind w:left="720"/>
       </w:pPr>
       <w:r>
         <w:rPr>

</xml_diff>